<commit_message>
Report: correct feature shape (images resized to 32x32: MNIST/FMNIST features 3x16x16 = 768, not 588) and head sizes (5.3k-110k); add HTML style samples
Co-Authored-By: Claude Opus 5.5 <noreply@anthropic.com>
</commit_message>
<xml_diff>
--- a/docs/professor_report/ESA_Research_Report.docx
+++ b/docs/professor_report/ESA_Research_Report.docx
@@ -2640,7 +2640,7 @@
                 <w:sz w:val="18"/>
                 <w:szCs w:val="18"/>
               </w:rPr>
-              <w:t xml:space="preserve">image 1×28×28 (MNIST) / 3×32×32</w:t>
+              <w:t xml:space="preserve">image resized to 1×32×32 (MNIST, FMNIST) / 3×32×32</w:t>
             </w:r>
           </w:p>
         </w:tc>
@@ -2670,7 +2670,7 @@
                 <w:sz w:val="18"/>
                 <w:szCs w:val="18"/>
               </w:rPr>
-              <w:t xml:space="preserve">feature h: 3×14×14 = 588; SVHN 3×16×16 = 768; CIFAR-10 10×16×16 = 2,560</w:t>
+              <w:t xml:space="preserve">feature h: 3×16×16 = 768 (MNIST, FMNIST, SVHN); CIFAR-10 10×16×16 = 2,560</w:t>
             </w:r>
           </w:p>
         </w:tc>
@@ -3004,7 +3004,7 @@
                 <w:sz w:val="18"/>
                 <w:szCs w:val="18"/>
               </w:rPr>
-              <w:t xml:space="preserve">3.9 k – 108.8 k</w:t>
+              <w:t xml:space="preserve">5.3 k – 109.8 k</w:t>
             </w:r>
           </w:p>
         </w:tc>
@@ -3184,7 +3184,7 @@
         <w:t xml:space="preserve">Uplink:</w:t>
       </w:r>
       <w:r>
-        <w:t xml:space="preserve"> φ's weights (36–390 numbers) and the head's weights (3.9 k–109 k numbers).</w:t>
+        <w:t xml:space="preserve"> φ's weights (36–390 numbers) and the head's weights (5.3 k–110 k numbers).</w:t>
       </w:r>
     </w:p>
     <w:p>
@@ -3807,7 +3807,7 @@
                 <w:sz w:val="18"/>
                 <w:szCs w:val="18"/>
               </w:rPr>
-              <w:t xml:space="preserve">φ (36–390) + head (3.9 k–109 k numbers)</w:t>
+              <w:t xml:space="preserve">φ (36–390) + head (5.3 k–110 k numbers)</w:t>
             </w:r>
           </w:p>
         </w:tc>
@@ -17975,7 +17975,7 @@
                 <w:sz w:val="18"/>
                 <w:szCs w:val="18"/>
               </w:rPr>
-              <w:t xml:space="preserve">3×14×14</w:t>
+              <w:t xml:space="preserve">3×16×16</w:t>
             </w:r>
           </w:p>
         </w:tc>
@@ -18157,7 +18157,7 @@
                 <w:sz w:val="18"/>
                 <w:szCs w:val="18"/>
               </w:rPr>
-              <w:t xml:space="preserve">3×14×14</w:t>
+              <w:t xml:space="preserve">3×16×16</w:t>
             </w:r>
           </w:p>
         </w:tc>

</xml_diff>